<commit_message>
Resume pass 1: fix master-catalog traceability-matrix rotation (16 parallel-universe filenames aligned to shipped docs + approval_band evidence); complete 8 truncated Mermaid DSL blocks in business docx (Word-conversion artifacts; md twins were already complete)
</commit_message>
<xml_diff>
--- a/business_document/02_sales_enablement/DOC-08_Buyer_Persona_Matrix.docx
+++ b/business_document/02_sales_enablement/DOC-08_Buyer_Persona_Matrix.docx
@@ -774,17 +774,7 @@
                 <w:color w:val="1E2660"/>
                 <w:sz w:val="18"/>
               </w:rPr>
-              <w:t xml:space="preserve">System Architecture Specification (Mermaid DSL):  </w:t>
-            </w:r>
-            <w:r>
-              <w:rPr>
-                <w:rFonts w:ascii="Calibri" w:hAnsi="Calibri" w:eastAsia="Calibri"/>
-                <w:b w:val="0"/>
-                <w:i w:val="0"/>
-                <w:color w:val="222222"/>
-                <w:sz w:val="18"/>
-              </w:rPr>
-              <w:t>[Diagram Topology: flowchart TD]</w:t>
+              <w:t>System Architecture Specification (Mermaid DSL):  [Diagram Topology: flowchart TD]</w:t>
               <w:br/>
               <w:t>flowchart TD</w:t>
               <w:br/>
@@ -796,7 +786,16 @@
               <w:br/>
               <w:t xml:space="preserve">        CRO["2. Chief Risk Officer (CRO)&lt;br/&gt;Asset Quality &amp; BRPD 15/2024"]</w:t>
               <w:br/>
-              <w:t xml:space="preserve">        CIO["3. Chief Information Officer (CIO)&lt;br/&gt;Architecture, CBS &amp; Security"]</w:t>
+              <w:t xml:space="preserve">        CIO["3. Chief Information Officer (CIO)&lt;br/&gt;Architecture, CBS &amp; Security"]        CFO["4. Chief Financial Officer&lt;br/&gt;TCO, Budget and ROI Authority"]        CTO["5. Chief Technology Officer&lt;br/&gt;Integration and Data Migration"]        HEAD_RETAIL["6. Head of Retail Banking&lt;br/&gt;Branch Operations and TAT"]    end    MD --&gt; ttee</w:t>
+            </w:r>
+            <w:r>
+              <w:rPr>
+                <w:rFonts w:ascii="Calibri" w:hAnsi="Calibri" w:eastAsia="Calibri"/>
+                <w:b w:val="0"/>
+                <w:i w:val="0"/>
+                <w:color w:val="222222"/>
+                <w:sz w:val="18"/>
+              </w:rPr>
             </w:r>
           </w:p>
         </w:tc>

</xml_diff>